<commit_message>
Update Trang primer to model v2.1 figures (P90 basis)
Raise 78.3m, all-in 10.87 (11.11 capped), reserve 5.07m, cushion 3.92m,
tight year 2027; sourced from ROX production and cost data of 27 August.

Co-Authored-By: Claude <noreply@anthropic.com>
Claude-Session: https://claude.ai/code/session_016AF6cyqE99JTz5reixcHr8
</commit_message>
<xml_diff>
--- a/writing/rox/8_21_26_ROX_Trang_Primer.docx
+++ b/writing/rox/8_21_26_ROX_Trang_Primer.docx
@@ -24,7 +24,7 @@
       </w:pPr>
       <w:r>
         <w:rPr/>
-        <w:t>ROX x Republic Advisory · 21 August 2026 · Confidential</w:t>
+        <w:t>ROX x Republic Advisory · 27 August 2026 · Confidential</w:t>
       </w:r>
     </w:p>
     <w:p>
@@ -36,7 +36,7 @@
       </w:pPr>
       <w:r>
         <w:rPr/>
-        <w:t>A two-page companion to the executive memo. Figures are the base case (no price cap, per ROX's stated position of 21 August); the capped figure follows in brackets where it differs.</w:t>
+        <w:t>A two-page companion to the executive memo. Figures are the base case: no price cap, per ROX's stated position, at the P90 production basis, the output the plant beats nine years in ten, on ROX's own data of 27 August. The capped figure follows in brackets where it differs.</w:t>
       </w:r>
     </w:p>
     <w:p>
@@ -472,7 +472,7 @@
             </w:pPr>
             <w:r>
               <w:rPr/>
-              <w:t>Fees at close, $1.7m spent on day one</w:t>
+              <w:t>Fees at close, $1.8m spent on day one</w:t>
             </w:r>
           </w:p>
         </w:tc>
@@ -496,7 +496,7 @@
             </w:pPr>
             <w:r>
               <w:rPr/>
-              <w:t>+0.50</w:t>
+              <w:t>+0.36</w:t>
             </w:r>
           </w:p>
         </w:tc>
@@ -520,7 +520,7 @@
             </w:pPr>
             <w:r>
               <w:rPr/>
-              <w:t>7.17%</w:t>
+              <w:t>7.03%</w:t>
             </w:r>
           </w:p>
         </w:tc>
@@ -547,7 +547,7 @@
             </w:pPr>
             <w:r>
               <w:rPr/>
-              <w:t>The reserve: $3.51m locked for the term, earning nothing</w:t>
+              <w:t>The reserve: $5.07m locked for the term, earning nothing</w:t>
             </w:r>
           </w:p>
         </w:tc>
@@ -571,7 +571,7 @@
             </w:pPr>
             <w:r>
               <w:rPr/>
-              <w:t>+0.64</w:t>
+              <w:t>+0.62</w:t>
             </w:r>
           </w:p>
         </w:tc>
@@ -595,7 +595,7 @@
             </w:pPr>
             <w:r>
               <w:rPr/>
-              <w:t>7.81%</w:t>
+              <w:t>7.65%</w:t>
             </w:r>
           </w:p>
         </w:tc>
@@ -646,7 +646,7 @@
             </w:pPr>
             <w:r>
               <w:rPr/>
-              <w:t>+2.40</w:t>
+              <w:t>+2.39</w:t>
             </w:r>
           </w:p>
         </w:tc>
@@ -670,7 +670,7 @@
             </w:pPr>
             <w:r>
               <w:rPr/>
-              <w:t>10.21%</w:t>
+              <w:t>10.04%</w:t>
             </w:r>
           </w:p>
         </w:tc>
@@ -697,7 +697,7 @@
             </w:pPr>
             <w:r>
               <w:rPr/>
-              <w:t>ROX protective capital: $2.71m of ROX cash locked beneath the notes</w:t>
+              <w:t>ROX protective capital: $3.92m of ROX cash locked beneath the notes</w:t>
             </w:r>
           </w:p>
         </w:tc>
@@ -721,7 +721,7 @@
             </w:pPr>
             <w:r>
               <w:rPr/>
-              <w:t>+0.86</w:t>
+              <w:t>+0.83</w:t>
             </w:r>
           </w:p>
         </w:tc>
@@ -747,11 +747,11 @@
               <w:rPr>
                 <w:b/>
               </w:rPr>
-              <w:t>11.07%</w:t>
-            </w:r>
-            <w:r>
-              <w:rPr/>
-              <w:t xml:space="preserve"> (11.45%)</w:t>
+              <w:t>10.87%</w:t>
+            </w:r>
+            <w:r>
+              <w:rPr/>
+              <w:t xml:space="preserve"> (11.11%)</w:t>
             </w:r>
           </w:p>
         </w:tc>
@@ -1044,7 +1044,7 @@
             </w:pPr>
             <w:r>
               <w:rPr/>
-              <w:t>Capacity for the full $54.1m</w:t>
+              <w:t>Capacity for the full $78.3m</w:t>
             </w:r>
           </w:p>
         </w:tc>
@@ -1341,7 +1341,7 @@
             </w:pPr>
             <w:r>
               <w:rPr/>
-              <w:t>A fee below the saving (100–300 basis points against roughly 3 points saved)</w:t>
+              <w:t>A fee below the saving (100 to 300 basis points against roughly 3 points saved)</w:t>
             </w:r>
           </w:p>
         </w:tc>
@@ -1551,7 +1551,7 @@
       </w:pPr>
       <w:r>
         <w:rPr/>
-        <w:t>Worked once: 2033, the tightest year, clears $8.58m. Divided by 1.30, that year can afford a bill of $6.60m, which is exactly the bill on $54.1m of notes. One dollar more and 2033 breaks the rule. ($33.9m if the cap binds; the tight year is then 2041.)</w:t>
+        <w:t>Worked once: 2027, the tightest year, clears $13.19m. Divided by 1.30, that year can afford a bill of $10.15m, which is exactly the bill on $78.3m of notes. One dollar more and 2027 breaks the rule. ($50.8m if the cap binds; the tight year is then 2041.)</w:t>
       </w:r>
     </w:p>
     <w:p>
@@ -1563,7 +1563,7 @@
       </w:pPr>
       <w:r>
         <w:rPr/>
-        <w:t>Totals do not matter: if the cap binds the plant earns $110.4m against $60.8m owed over the term, 1.8 times, yet the weakest single year still caps the raise, because debt is paid year by year, not on average.</w:t>
+        <w:t>Totals do not matter: even if the cap binds the plant earns $161.0m against $91.1m owed over the term, 1.8 times, yet the weakest single year still caps the raise, because debt is paid year by year, not on average.</w:t>
       </w:r>
     </w:p>
     <w:p>
@@ -1580,7 +1580,7 @@
         <w:rPr>
           <w:i/>
         </w:rPr>
-        <w:t>Prepared by Republic. Figures from financing model v1.9; nothing here replaces the executive memo.</w:t>
+        <w:t>Prepared by Republic. Figures from financing model v2.1, on ROX's production and cost data; nothing here replaces the executive memo.</w:t>
       </w:r>
     </w:p>
     <w:sectPr>

</xml_diff>

<commit_message>
Update Trang primer to model v2.5 (P50 base per ROX, 1 September)
Base moved to P50 on ROX instruction, turnover tax zeroed pending the
Investment Agreement exemption, build spend re-timed to ROX's phasing.
Raise 87.6, all-in 10.82 (11.03 capped), walk steps refreshed.

Co-Authored-By: Claude Fable 5 <noreply@anthropic.com>
Claude-Session: https://claude.ai/code/session_016AF6cyqE99JTz5reixcHr8
</commit_message>
<xml_diff>
--- a/writing/rox/8_21_26_ROX_Trang_Primer.docx
+++ b/writing/rox/8_21_26_ROX_Trang_Primer.docx
@@ -24,7 +24,7 @@
       </w:pPr>
       <w:r>
         <w:rPr/>
-        <w:t>ROX x Republic Advisory · 27 August 2026 · Confidential</w:t>
+        <w:t>ROX x Republic Advisory · 1 September 2026 · Confidential</w:t>
       </w:r>
     </w:p>
     <w:p>
@@ -36,7 +36,7 @@
       </w:pPr>
       <w:r>
         <w:rPr/>
-        <w:t>A two-page companion to the executive memo. Figures are the base case: no price cap, per ROX's stated position, at the P90 production basis, the output the plant beats nine years in ten, on ROX's own data of 27 August. The capped figure follows in brackets where it differs.</w:t>
+        <w:t>A two-page companion to the executive memo. Figures are the base case: no price cap, per ROX's stated position, at the P50 production basis, the output beaten one year in two, set as the base by ROX on 1 September 2026, on ROX's own data. The capped figure follows in brackets where it differs.</w:t>
       </w:r>
     </w:p>
     <w:p>
@@ -496,7 +496,7 @@
             </w:pPr>
             <w:r>
               <w:rPr/>
-              <w:t>+0.36</w:t>
+              <w:t>+0.33</w:t>
             </w:r>
           </w:p>
         </w:tc>
@@ -520,7 +520,7 @@
             </w:pPr>
             <w:r>
               <w:rPr/>
-              <w:t>7.03%</w:t>
+              <w:t>7.00%</w:t>
             </w:r>
           </w:p>
         </w:tc>
@@ -547,7 +547,7 @@
             </w:pPr>
             <w:r>
               <w:rPr/>
-              <w:t>The reserve: $5.07m locked for the term, earning nothing</w:t>
+              <w:t>The reserve: $5.68m locked for the term, earning nothing</w:t>
             </w:r>
           </w:p>
         </w:tc>
@@ -571,7 +571,7 @@
             </w:pPr>
             <w:r>
               <w:rPr/>
-              <w:t>+0.62</w:t>
+              <w:t>+0.74</w:t>
             </w:r>
           </w:p>
         </w:tc>
@@ -595,7 +595,7 @@
             </w:pPr>
             <w:r>
               <w:rPr/>
-              <w:t>7.65%</w:t>
+              <w:t>7.74%</w:t>
             </w:r>
           </w:p>
         </w:tc>
@@ -646,7 +646,7 @@
             </w:pPr>
             <w:r>
               <w:rPr/>
-              <w:t>+2.39</w:t>
+              <w:t>+2.26</w:t>
             </w:r>
           </w:p>
         </w:tc>
@@ -670,7 +670,7 @@
             </w:pPr>
             <w:r>
               <w:rPr/>
-              <w:t>10.04%</w:t>
+              <w:t>10.00%</w:t>
             </w:r>
           </w:p>
         </w:tc>
@@ -697,7 +697,7 @@
             </w:pPr>
             <w:r>
               <w:rPr/>
-              <w:t>ROX protective capital: $3.92m of ROX cash locked beneath the notes</w:t>
+              <w:t>ROX protective capital: $4.38m of ROX cash locked beneath the notes</w:t>
             </w:r>
           </w:p>
         </w:tc>
@@ -747,11 +747,11 @@
               <w:rPr>
                 <w:b/>
               </w:rPr>
-              <w:t>10.87%</w:t>
-            </w:r>
-            <w:r>
-              <w:rPr/>
-              <w:t xml:space="preserve"> (11.11%)</w:t>
+              <w:t>10.82%</w:t>
+            </w:r>
+            <w:r>
+              <w:rPr/>
+              <w:t xml:space="preserve"> (11.03%)</w:t>
             </w:r>
           </w:p>
         </w:tc>
@@ -1044,7 +1044,7 @@
             </w:pPr>
             <w:r>
               <w:rPr/>
-              <w:t>Capacity for the full $78.3m</w:t>
+              <w:t>Capacity for the full $87.6m</w:t>
             </w:r>
           </w:p>
         </w:tc>
@@ -1551,7 +1551,7 @@
       </w:pPr>
       <w:r>
         <w:rPr/>
-        <w:t>Worked once: 2027, the tightest year, clears $13.19m. Divided by 1.30, that year can afford a bill of $10.15m, which is exactly the bill on $78.3m of notes. One dollar more and 2027 breaks the rule. ($50.8m if the cap binds; the tight year is then 2041.)</w:t>
+        <w:t>Worked once: 2027, the tightest year, clears $14.76m. Divided by 1.30, that year can afford a bill of $11.36m, which is exactly the bill on $87.6m of notes. One dollar more and 2027 breaks the rule. ($57.0m if the cap binds; the tight year is then 2041.)</w:t>
       </w:r>
     </w:p>
     <w:p>
@@ -1563,7 +1563,7 @@
       </w:pPr>
       <w:r>
         <w:rPr/>
-        <w:t>Totals do not matter: even if the cap binds the plant earns $161.0m against $91.1m owed over the term, 1.8 times, yet the weakest single year still caps the raise, because debt is paid year by year, not on average.</w:t>
+        <w:t>Totals do not matter: even if the cap binds the plant earns $180.1m against $102.1m owed over the term, 1.8 times, yet the weakest single year still caps the raise, because debt is paid year by year, not on average.</w:t>
       </w:r>
     </w:p>
     <w:p>
@@ -1580,7 +1580,7 @@
         <w:rPr>
           <w:i/>
         </w:rPr>
-        <w:t>Prepared by Republic. Figures from financing model v2.1, on ROX's production and cost data; nothing here replaces the executive memo.</w:t>
+        <w:t>Prepared by Republic. Figures from financing model v2.5, on ROX's production and cost data; nothing here replaces the executive memo.</w:t>
       </w:r>
     </w:p>
     <w:sectPr>

</xml_diff>

<commit_message>
Primer: replace bind/binds wording, reference model v2.6
Co-Authored-By: Claude <noreply@anthropic.com>
Claude-Session: https://claude.ai/code/session_016AF6cyqE99JTz5reixcHr8
</commit_message>
<xml_diff>
--- a/writing/rox/8_21_26_ROX_Trang_Primer.docx
+++ b/writing/rox/8_21_26_ROX_Trang_Primer.docx
@@ -1551,7 +1551,7 @@
       </w:pPr>
       <w:r>
         <w:rPr/>
-        <w:t>Worked once: 2027, the tightest year, clears $14.76m. Divided by 1.30, that year can afford a bill of $11.36m, which is exactly the bill on $87.6m of notes. One dollar more and 2027 breaks the rule. ($57.0m if the cap binds; the tight year is then 2041.)</w:t>
+        <w:t>Worked once: 2027, the tightest year, clears $14.76m. Divided by 1.30, that year can afford a bill of $11.36m, which is exactly the bill on $87.6m of notes. One dollar more and 2027 breaks the rule. ($57.0m if the cap applies; the tight year is then 2041.)</w:t>
       </w:r>
     </w:p>
     <w:p>
@@ -1563,7 +1563,7 @@
       </w:pPr>
       <w:r>
         <w:rPr/>
-        <w:t>Totals do not matter: even if the cap binds the plant earns $180.1m against $102.1m owed over the term, 1.8 times, yet the weakest single year still caps the raise, because debt is paid year by year, not on average.</w:t>
+        <w:t>Totals do not matter: even if the cap applies the plant earns $180.1m against $102.1m owed over the term, 1.8 times, yet the weakest single year still caps the raise, because debt is paid year by year, not on average.</w:t>
       </w:r>
     </w:p>
     <w:p>
@@ -1580,7 +1580,7 @@
         <w:rPr>
           <w:i/>
         </w:rPr>
-        <w:t>Prepared by Republic. Figures from financing model v2.5, on ROX's production and cost data; nothing here replaces the executive memo.</w:t>
+        <w:t>Prepared by Republic. Figures from financing model v2.6, on ROX's production and cost data; nothing here replaces the executive memo.</w:t>
       </w:r>
     </w:p>
     <w:sectPr>

</xml_diff>